<commit_message>
Update documents and content with latest changes
- Updated insights.html with new content modifications
- Updated resources.html with latest changes
- Reuploaded and updated unit1.docx, unit2.docx, unit3.docx, unit4.docx documents
- All assignment documents refreshed with current content
</commit_message>
<xml_diff>
--- a/unit1.docx
+++ b/unit1.docx
@@ -53,12 +53,6 @@
         <w:gridCol w:w="9360"/>
       </w:tblGrid>
       <w:tr>
-        <w:tblPrEx>
-          <w:tblCellMar>
-            <w:top w:w="0" w:type="dxa"/>
-            <w:bottom w:w="0" w:type="dxa"/>
-          </w:tblCellMar>
-        </w:tblPrEx>
         <w:tc>
           <w:tcPr>
             <w:tcW w:w="9360" w:type="dxa"/>
@@ -344,12 +338,6 @@
         <w:gridCol w:w="4960"/>
       </w:tblGrid>
       <w:tr>
-        <w:tblPrEx>
-          <w:tblCellMar>
-            <w:top w:w="0" w:type="dxa"/>
-            <w:bottom w:w="0" w:type="dxa"/>
-          </w:tblCellMar>
-        </w:tblPrEx>
         <w:trPr>
           <w:tblHeader/>
         </w:trPr>
@@ -445,12 +433,6 @@
         </w:tc>
       </w:tr>
       <w:tr>
-        <w:tblPrEx>
-          <w:tblCellMar>
-            <w:top w:w="0" w:type="dxa"/>
-            <w:bottom w:w="0" w:type="dxa"/>
-          </w:tblCellMar>
-        </w:tblPrEx>
         <w:tc>
           <w:tcPr>
             <w:tcW w:w="2400" w:type="dxa"/>
@@ -537,12 +519,6 @@
         </w:tc>
       </w:tr>
       <w:tr>
-        <w:tblPrEx>
-          <w:tblCellMar>
-            <w:top w:w="0" w:type="dxa"/>
-            <w:bottom w:w="0" w:type="dxa"/>
-          </w:tblCellMar>
-        </w:tblPrEx>
         <w:tc>
           <w:tcPr>
             <w:tcW w:w="2400" w:type="dxa"/>
@@ -631,12 +607,6 @@
         </w:tc>
       </w:tr>
       <w:tr>
-        <w:tblPrEx>
-          <w:tblCellMar>
-            <w:top w:w="0" w:type="dxa"/>
-            <w:bottom w:w="0" w:type="dxa"/>
-          </w:tblCellMar>
-        </w:tblPrEx>
         <w:tc>
           <w:tcPr>
             <w:tcW w:w="2400" w:type="dxa"/>
@@ -725,12 +695,6 @@
         </w:tc>
       </w:tr>
       <w:tr>
-        <w:tblPrEx>
-          <w:tblCellMar>
-            <w:top w:w="0" w:type="dxa"/>
-            <w:bottom w:w="0" w:type="dxa"/>
-          </w:tblCellMar>
-        </w:tblPrEx>
         <w:tc>
           <w:tcPr>
             <w:tcW w:w="2400" w:type="dxa"/>
@@ -817,12 +781,6 @@
         </w:tc>
       </w:tr>
       <w:tr>
-        <w:tblPrEx>
-          <w:tblCellMar>
-            <w:top w:w="0" w:type="dxa"/>
-            <w:bottom w:w="0" w:type="dxa"/>
-          </w:tblCellMar>
-        </w:tblPrEx>
         <w:tc>
           <w:tcPr>
             <w:tcW w:w="2400" w:type="dxa"/>
@@ -912,12 +870,6 @@
         </w:tc>
       </w:tr>
       <w:tr>
-        <w:tblPrEx>
-          <w:tblCellMar>
-            <w:top w:w="0" w:type="dxa"/>
-            <w:bottom w:w="0" w:type="dxa"/>
-          </w:tblCellMar>
-        </w:tblPrEx>
         <w:tc>
           <w:tcPr>
             <w:tcW w:w="2400" w:type="dxa"/>
@@ -1150,7 +1102,13 @@
       </w:r>
       <w:proofErr w:type="gramEnd"/>
       <w:r>
-        <w:t>) as separate methods. Each version has a different design goal. You must write a comment above each method that reads like a policy statement — not a math explanation.</w:t>
+        <w:t xml:space="preserve">) as separate methods. Each version has a different design goal. You must write a comment above each method that reads like a policy statement </w:t>
+      </w:r>
+      <w:r>
+        <w:t>with mathematical backing</w:t>
+      </w:r>
+      <w:r>
+        <w:t>.</w:t>
       </w:r>
     </w:p>
     <w:p>
@@ -1179,12 +1137,6 @@
         <w:gridCol w:w="9360"/>
       </w:tblGrid>
       <w:tr>
-        <w:tblPrEx>
-          <w:tblCellMar>
-            <w:top w:w="0" w:type="dxa"/>
-            <w:bottom w:w="0" w:type="dxa"/>
-          </w:tblCellMar>
-        </w:tblPrEx>
         <w:tc>
           <w:tcPr>
             <w:tcW w:w="9360" w:type="dxa"/>
@@ -1224,25 +1176,65 @@
                 <w:sz w:val="20"/>
                 <w:szCs w:val="20"/>
               </w:rPr>
-              <w:t xml:space="preserve">Your comment must say what the algorithm values and who benefits, not just what the formula does. Example of a bad comment: // multiplies </w:t>
-            </w:r>
-            <w:proofErr w:type="spellStart"/>
+              <w:t>Comments</w:t>
+            </w:r>
             <w:r>
               <w:rPr>
                 <w:color w:val="333333"/>
                 <w:sz w:val="20"/>
                 <w:szCs w:val="20"/>
               </w:rPr>
-              <w:t>viewCount</w:t>
-            </w:r>
-            <w:proofErr w:type="spellEnd"/>
+              <w:t xml:space="preserve"> must </w:t>
+            </w:r>
             <w:r>
               <w:rPr>
                 <w:color w:val="333333"/>
                 <w:sz w:val="20"/>
                 <w:szCs w:val="20"/>
               </w:rPr>
-              <w:t xml:space="preserve"> by 10. Example of a good comment: // Prioritizes already-popular videos. Rewards scale. New creators will rarely surface under this system.</w:t>
+              <w:t>prioritize</w:t>
+            </w:r>
+            <w:r>
+              <w:rPr>
+                <w:color w:val="333333"/>
+                <w:sz w:val="20"/>
+                <w:szCs w:val="20"/>
+              </w:rPr>
+              <w:t xml:space="preserve"> what the algorithm values and who benefits, not just what the formula does. Example of a bad comment: // multiplies </w:t>
+            </w:r>
+            <w:proofErr w:type="spellStart"/>
+            <w:r>
+              <w:rPr>
+                <w:color w:val="333333"/>
+                <w:sz w:val="20"/>
+                <w:szCs w:val="20"/>
+              </w:rPr>
+              <w:t>viewCount</w:t>
+            </w:r>
+            <w:proofErr w:type="spellEnd"/>
+            <w:r>
+              <w:rPr>
+                <w:color w:val="333333"/>
+                <w:sz w:val="20"/>
+                <w:szCs w:val="20"/>
+              </w:rPr>
+              <w:t xml:space="preserve"> by 10. Example of a good comment: // Prioritizes already-popular videos</w:t>
+            </w:r>
+            <w:r>
+              <w:rPr>
+                <w:color w:val="333333"/>
+                <w:sz w:val="20"/>
+                <w:szCs w:val="20"/>
+              </w:rPr>
+              <w:t xml:space="preserve"> and</w:t>
+            </w:r>
+            <w:r>
+              <w:rPr>
+                <w:color w:val="333333"/>
+                <w:sz w:val="20"/>
+                <w:szCs w:val="20"/>
+              </w:rPr>
+              <w:t xml:space="preserve"> scale. New creators will rarely surface under this system.</w:t>
             </w:r>
           </w:p>
         </w:tc>
@@ -1276,12 +1268,6 @@
         <w:gridCol w:w="3160"/>
       </w:tblGrid>
       <w:tr>
-        <w:tblPrEx>
-          <w:tblCellMar>
-            <w:top w:w="0" w:type="dxa"/>
-            <w:bottom w:w="0" w:type="dxa"/>
-          </w:tblCellMar>
-        </w:tblPrEx>
         <w:trPr>
           <w:tblHeader/>
         </w:trPr>
@@ -1377,12 +1363,6 @@
         </w:tc>
       </w:tr>
       <w:tr>
-        <w:tblPrEx>
-          <w:tblCellMar>
-            <w:top w:w="0" w:type="dxa"/>
-            <w:bottom w:w="0" w:type="dxa"/>
-          </w:tblCellMar>
-        </w:tblPrEx>
         <w:tc>
           <w:tcPr>
             <w:tcW w:w="2800" w:type="dxa"/>
@@ -1516,12 +1496,6 @@
         </w:tc>
       </w:tr>
       <w:tr>
-        <w:tblPrEx>
-          <w:tblCellMar>
-            <w:top w:w="0" w:type="dxa"/>
-            <w:bottom w:w="0" w:type="dxa"/>
-          </w:tblCellMar>
-        </w:tblPrEx>
         <w:tc>
           <w:tcPr>
             <w:tcW w:w="2800" w:type="dxa"/>
@@ -1630,12 +1604,6 @@
         </w:tc>
       </w:tr>
       <w:tr>
-        <w:tblPrEx>
-          <w:tblCellMar>
-            <w:top w:w="0" w:type="dxa"/>
-            <w:bottom w:w="0" w:type="dxa"/>
-          </w:tblCellMar>
-        </w:tblPrEx>
         <w:tc>
           <w:tcPr>
             <w:tcW w:w="2800" w:type="dxa"/>
@@ -1930,12 +1898,6 @@
         <w:gridCol w:w="9360"/>
       </w:tblGrid>
       <w:tr>
-        <w:tblPrEx>
-          <w:tblCellMar>
-            <w:top w:w="0" w:type="dxa"/>
-            <w:bottom w:w="0" w:type="dxa"/>
-          </w:tblCellMar>
-        </w:tblPrEx>
         <w:tc>
           <w:tcPr>
             <w:tcW w:w="9360" w:type="dxa"/>
@@ -1965,7 +1927,7 @@
                 <w:sz w:val="20"/>
                 <w:szCs w:val="20"/>
               </w:rPr>
-              <w:t>Seeding tip for teachers</w:t>
+              <w:t>For teachers</w:t>
             </w:r>
           </w:p>
           <w:p>
@@ -1975,43 +1937,67 @@
                 <w:sz w:val="20"/>
                 <w:szCs w:val="20"/>
               </w:rPr>
-              <w:t xml:space="preserve">Include 2–3 “rabbit hole” videos in the dataset — high </w:t>
-            </w:r>
-            <w:proofErr w:type="spellStart"/>
+              <w:t>Manipulating data with</w:t>
+            </w:r>
             <w:r>
               <w:rPr>
                 <w:color w:val="333333"/>
                 <w:sz w:val="20"/>
                 <w:szCs w:val="20"/>
               </w:rPr>
-              <w:t>viewCount</w:t>
-            </w:r>
-            <w:proofErr w:type="spellEnd"/>
+              <w:t xml:space="preserve"> high </w:t>
+            </w:r>
+            <w:proofErr w:type="spellStart"/>
             <w:r>
               <w:rPr>
                 <w:color w:val="333333"/>
                 <w:sz w:val="20"/>
                 <w:szCs w:val="20"/>
               </w:rPr>
-              <w:t xml:space="preserve">, high </w:t>
-            </w:r>
-            <w:proofErr w:type="spellStart"/>
+              <w:t>viewCount</w:t>
+            </w:r>
+            <w:proofErr w:type="spellEnd"/>
             <w:r>
               <w:rPr>
                 <w:color w:val="333333"/>
                 <w:sz w:val="20"/>
                 <w:szCs w:val="20"/>
               </w:rPr>
-              <w:t>likeRatio</w:t>
-            </w:r>
-            <w:proofErr w:type="spellEnd"/>
+              <w:t xml:space="preserve">, high </w:t>
+            </w:r>
+            <w:proofErr w:type="spellStart"/>
             <w:r>
               <w:rPr>
                 <w:color w:val="333333"/>
                 <w:sz w:val="20"/>
                 <w:szCs w:val="20"/>
               </w:rPr>
-              <w:t>, but category = “misinformation” or “rage-bait”. The engagement-maximizing feed will almost always surface them. This moment tends to land hard.</w:t>
+              <w:t>likeRatio</w:t>
+            </w:r>
+            <w:proofErr w:type="spellEnd"/>
+            <w:r>
+              <w:rPr>
+                <w:color w:val="333333"/>
+                <w:sz w:val="20"/>
+                <w:szCs w:val="20"/>
+              </w:rPr>
+              <w:t>, but category = “misinformation” or “rage-bait”</w:t>
+            </w:r>
+            <w:r>
+              <w:rPr>
+                <w:color w:val="333333"/>
+                <w:sz w:val="20"/>
+                <w:szCs w:val="20"/>
+              </w:rPr>
+              <w:t xml:space="preserve"> if students need assistance seeing the flaw in the code</w:t>
+            </w:r>
+            <w:r>
+              <w:rPr>
+                <w:color w:val="333333"/>
+                <w:sz w:val="20"/>
+                <w:szCs w:val="20"/>
+              </w:rPr>
+              <w:t xml:space="preserve"> The engagement-maximizing feed will almost always surface them. </w:t>
             </w:r>
           </w:p>
         </w:tc>
@@ -2136,12 +2122,6 @@
         <w:gridCol w:w="9360"/>
       </w:tblGrid>
       <w:tr>
-        <w:tblPrEx>
-          <w:tblCellMar>
-            <w:top w:w="0" w:type="dxa"/>
-            <w:bottom w:w="0" w:type="dxa"/>
-          </w:tblCellMar>
-        </w:tblPrEx>
         <w:tc>
           <w:tcPr>
             <w:tcW w:w="9360" w:type="dxa"/>
@@ -2160,9 +2140,6 @@
             </w:tcMar>
           </w:tcPr>
           <w:p>
-            <w:pPr>
-              <w:spacing w:after="60"/>
-            </w:pPr>
             <w:r>
               <w:rPr>
                 <w:b/>
@@ -2171,17 +2148,63 @@
                 <w:sz w:val="20"/>
                 <w:szCs w:val="20"/>
               </w:rPr>
-              <w:t>Grading note</w:t>
-            </w:r>
-          </w:p>
-          <w:p>
+              <w:t>Push students to cite</w:t>
+            </w:r>
             <w:r>
               <w:rPr>
                 <w:color w:val="333333"/>
                 <w:sz w:val="20"/>
                 <w:szCs w:val="20"/>
               </w:rPr>
-              <w:t>Full credit requires citing a specific variable name or numeric weight from your code — not just a general claim about algorithms. The connection between the line of code and the real-world consequence must be explicit.</w:t>
+              <w:t xml:space="preserve"> a specific variable name or numeric weight from </w:t>
+            </w:r>
+            <w:r>
+              <w:rPr>
+                <w:color w:val="333333"/>
+                <w:sz w:val="20"/>
+                <w:szCs w:val="20"/>
+              </w:rPr>
+              <w:t>tge</w:t>
+            </w:r>
+            <w:r>
+              <w:rPr>
+                <w:color w:val="333333"/>
+                <w:sz w:val="20"/>
+                <w:szCs w:val="20"/>
+              </w:rPr>
+              <w:t xml:space="preserve"> code </w:t>
+            </w:r>
+            <w:r>
+              <w:rPr>
+                <w:color w:val="333333"/>
+                <w:sz w:val="20"/>
+                <w:szCs w:val="20"/>
+              </w:rPr>
+              <w:t>rather than</w:t>
+            </w:r>
+            <w:r>
+              <w:rPr>
+                <w:color w:val="333333"/>
+                <w:sz w:val="20"/>
+                <w:szCs w:val="20"/>
+              </w:rPr>
+              <w:t xml:space="preserve"> just a general claim about algorithms</w:t>
+            </w:r>
+            <w:r>
+              <w:rPr>
+                <w:color w:val="333333"/>
+                <w:sz w:val="20"/>
+                <w:szCs w:val="20"/>
+              </w:rPr>
+              <w:t>; connect the specific</w:t>
+            </w:r>
+            <w:r>
+              <w:rPr>
+                <w:color w:val="333333"/>
+                <w:sz w:val="20"/>
+                <w:szCs w:val="20"/>
+              </w:rPr>
+              <w:t xml:space="preserve"> line of code and the real-world consequence.</w:t>
             </w:r>
           </w:p>
         </w:tc>
@@ -2226,7 +2249,10 @@
       </w:r>
       <w:proofErr w:type="gramEnd"/>
       <w:r>
-        <w:t>) that simultaneously maximizes engagement, ensures diversity, and lifts new creators? Try it. Then write two sentences explaining why it’s hard — not technically, but in terms of what values conflict.</w:t>
+        <w:t xml:space="preserve">) that simultaneously maximizes engagement, ensures diversity, and lifts new creators? Try it. Then write two sentences explaining why it’s </w:t>
+      </w:r>
+      <w:r>
+        <w:t>difficult to achieve</w:t>
       </w:r>
     </w:p>
     <w:p>
@@ -2247,41 +2273,15 @@
         <w:pStyle w:val="Heading2"/>
       </w:pPr>
       <w:r>
+        <w:t>Teacher notes</w:t>
+      </w:r>
+    </w:p>
+    <w:p>
+      <w:pPr>
+        <w:spacing w:before="60" w:after="80"/>
+      </w:pPr>
+      <w:r>
         <w:lastRenderedPageBreak/>
-        <w:t>Teacher notes</w:t>
-      </w:r>
-    </w:p>
-    <w:p>
-      <w:pPr>
-        <w:spacing w:before="60" w:after="80"/>
-      </w:pPr>
-      <w:r>
-        <w:t>The policy comment requirement is the most important constraint in this assignment. Students will instinctively write math comments; push them toward policy language. The shift from “this multiplies by 10” to “this rewards scale and punishes newcomers” is the core ethical move.</w:t>
-      </w:r>
-    </w:p>
-    <w:p>
-      <w:pPr>
-        <w:spacing w:before="60" w:after="60"/>
-      </w:pPr>
-    </w:p>
-    <w:p>
-      <w:pPr>
-        <w:spacing w:before="60" w:after="80"/>
-      </w:pPr>
-      <w:r>
-        <w:t>The class feed reveal works best with 6–8 pairs presenting simultaneously on a shared screen. Having pairs whose feed is flagged as “worrying” read their own policy comment aloud creates accountability without being punitive — the point is that the comment was honest, and the outcome is the policy.</w:t>
-      </w:r>
-    </w:p>
-    <w:p>
-      <w:pPr>
-        <w:spacing w:before="60" w:after="60"/>
-      </w:pPr>
-    </w:p>
-    <w:p>
-      <w:pPr>
-        <w:spacing w:before="60" w:after="80"/>
-      </w:pPr>
-      <w:r>
         <w:t>The extension question about the “impossible feed” previews Unit 3 concepts around design tradeoffs and can serve as a bridge. Save student answers for discussion when you reach class design.</w:t>
       </w:r>
     </w:p>

</xml_diff>